<commit_message>
refactor: detailed Chinese week11 explain docs (replace English)
</commit_message>
<xml_diff>
--- a/docs/notes/Week11_Step1_ContinuousEnv_逐行精讲.docx
+++ b/docs/notes/Week11_Step1_ContinuousEnv_逐行精讲.docx
@@ -2,7 +2,6 @@
 <file path=word/document.xml><?xml version="1.0" encoding="utf-8"?>
 <w:document xmlns:wpc="http://schemas.microsoft.com/office/word/2010/wordprocessingCanvas" xmlns:mo="http://schemas.microsoft.com/office/mac/office/2008/main" xmlns:mc="http://schemas.openxmlformats.org/markup-compatibility/2006" xmlns:mv="urn:schemas-microsoft-com:mac:vml" xmlns:o="urn:schemas-microsoft-com:office:office" xmlns:r="http://schemas.openxmlformats.org/officeDocument/2006/relationships" xmlns:m="http://schemas.openxmlformats.org/officeDocument/2006/math" xmlns:v="urn:schemas-microsoft-com:vml" xmlns:wp14="http://schemas.microsoft.com/office/word/2010/wordprocessingDrawing" xmlns:wp="http://schemas.openxmlformats.org/drawingml/2006/wordprocessingDrawing" xmlns:w10="urn:schemas-microsoft-com:office:word" xmlns:w="http://schemas.openxmlformats.org/wordprocessingml/2006/main" xmlns:w14="http://schemas.microsoft.com/office/word/2010/wordml" xmlns:wpg="http://schemas.microsoft.com/office/word/2010/wordprocessingGroup" xmlns:wpi="http://schemas.microsoft.com/office/word/2010/wordprocessingInk" xmlns:wne="http://schemas.microsoft.com/office/word/2006/wordml" xmlns:wps="http://schemas.microsoft.com/office/word/2010/wordprocessingShape" mc:Ignorable="w14 wp14">
   <w:body>
-    <w:p/>
     <w:p/>
     <w:p/>
     <w:p/>
@@ -16,7 +15,7 @@
           <w:color w:val="1F3A5F"/>
           <w:sz w:val="48"/>
         </w:rPr>
-        <w:t>Step 1: Continuous Action Environment</w:t>
+        <w:t>Step 1: 连续动作环境</w:t>
         <w:br/>
       </w:r>
       <w:r>
@@ -24,7 +23,7 @@
           <w:color w:val="666666"/>
           <w:sz w:val="26"/>
         </w:rPr>
-        <w:t>week11_continuous_env.py - EMS Simplified + Why DQN Fails</w:t>
+        <w:t>week11_continuous_env.py — EMS 简化版 + DQN 为什么不行</w:t>
       </w:r>
     </w:p>
     <w:p>
@@ -36,7 +35,7 @@
           <w:color w:val="999999"/>
           <w:sz w:val="20"/>
         </w:rPr>
-        <w:t>Generated: 2026-07-29</w:t>
+        <w:t>生成日期：2026-07-29</w:t>
       </w:r>
     </w:p>
     <w:p>
@@ -52,7 +51,7 @@
         <w:rPr>
           <w:color w:val="1F3A5F"/>
         </w:rPr>
-        <w:t>File Overview</w:t>
+        <w:t>文件概览</w:t>
       </w:r>
     </w:p>
     <w:p>
@@ -65,7 +64,38 @@
           <w:b w:val="0"/>
           <w:sz w:val="22"/>
         </w:rPr>
-        <w:t>Creates a continuous-action EMS environment (2D state, 1D continuous action) and demonstrates why DQN cannot handle continuous actions.</w:t>
+        <w:t>这个文件做了两件事：第一，创建了一个连续动作的 EMS 简化环境（状态 2 维、动作 1 维连续），第二，演示了 DQN 为什么处理不了连续动作。这是从 Week 10 的离散 GridWorld 跨越到连续动作 RL 的第一步。</w:t>
+      </w:r>
+    </w:p>
+    <w:p>
+      <w:pPr>
+        <w:spacing w:after="60"/>
+      </w:pPr>
+      <w:r>
+        <w:rPr>
+          <w:rFonts w:ascii="Microsoft YaHei" w:hAnsi="Microsoft YaHei"/>
+          <w:b w:val="0"/>
+          <w:sz w:val="22"/>
+        </w:rPr>
+        <w:t>核心对比：</w:t>
+      </w:r>
+    </w:p>
+    <w:p>
+      <w:pPr>
+        <w:pStyle w:val="ListBullet"/>
+        <w:ind w:left="850"/>
+      </w:pPr>
+      <w:r>
+        <w:t>GridWorld（Week 10）：离散状态 16 个、离散动作 4 个 → DQN 可以用</w:t>
+      </w:r>
+    </w:p>
+    <w:p>
+      <w:pPr>
+        <w:pStyle w:val="ListBullet"/>
+        <w:ind w:left="850"/>
+      </w:pPr>
+      <w:r>
+        <w:t>EMS 环境（Week 11）：连续状态 [SOC, P_load]、连续动作 P_fc ∈ [0,1] → DQN 不行</w:t>
       </w:r>
     </w:p>
     <w:tbl>
@@ -91,7 +121,7 @@
                 <w:b/>
                 <w:sz w:val="20"/>
               </w:rPr>
-              <w:t>Section</w:t>
+              <w:t>部分</w:t>
             </w:r>
           </w:p>
         </w:tc>
@@ -106,7 +136,7 @@
                 <w:b/>
                 <w:sz w:val="20"/>
               </w:rPr>
-              <w:t>Lines</w:t>
+              <w:t>行号</w:t>
             </w:r>
           </w:p>
         </w:tc>
@@ -121,7 +151,7 @@
                 <w:b/>
                 <w:sz w:val="20"/>
               </w:rPr>
-              <w:t>Content</w:t>
+              <w:t>内容</w:t>
             </w:r>
           </w:p>
         </w:tc>
@@ -137,7 +167,7 @@
                 <w:rFonts w:ascii="Microsoft YaHei" w:hAnsi="Microsoft YaHei"/>
                 <w:sz w:val="20"/>
               </w:rPr>
-              <w:t>EMSEnv class</w:t>
+              <w:t>EMSEnv 环境类</w:t>
             </w:r>
           </w:p>
         </w:tc>
@@ -165,7 +195,7 @@
                 <w:rFonts w:ascii="Microsoft YaHei" w:hAnsi="Microsoft YaHei"/>
                 <w:sz w:val="20"/>
               </w:rPr>
-              <w:t>Continuous state + continuous action + reward</w:t>
+              <w:t>定义连续状态 + 连续动作 + 奖励函数</w:t>
             </w:r>
           </w:p>
         </w:tc>
@@ -181,7 +211,7 @@
                 <w:rFonts w:ascii="Microsoft YaHei" w:hAnsi="Microsoft YaHei"/>
                 <w:sz w:val="20"/>
               </w:rPr>
-              <w:t>DQN failure demo</w:t>
+              <w:t>DQN_Continuous 网络</w:t>
             </w:r>
           </w:p>
         </w:tc>
@@ -195,7 +225,7 @@
                 <w:rFonts w:ascii="Microsoft YaHei" w:hAnsi="Microsoft YaHei"/>
                 <w:sz w:val="20"/>
               </w:rPr>
-              <w:t>115-203</w:t>
+              <w:t>115-133</w:t>
             </w:r>
           </w:p>
         </w:tc>
@@ -209,7 +239,7 @@
                 <w:rFonts w:ascii="Microsoft YaHei" w:hAnsi="Microsoft YaHei"/>
                 <w:sz w:val="20"/>
               </w:rPr>
-              <w:t>Shows why DQN fails on continuous actions</w:t>
+              <w:t>假 DQN——输出层只有 1 个神经元，不是 4 个 Q 值</w:t>
             </w:r>
           </w:p>
         </w:tc>
@@ -225,7 +255,51 @@
                 <w:rFonts w:ascii="Microsoft YaHei" w:hAnsi="Microsoft YaHei"/>
                 <w:sz w:val="20"/>
               </w:rPr>
-              <w:t>Environment test</w:t>
+              <w:t>demo_dqn_failure 演示</w:t>
+            </w:r>
+          </w:p>
+        </w:tc>
+        <w:tc>
+          <w:tcPr>
+            <w:tcW w:type="dxa" w:w="2880"/>
+          </w:tcPr>
+          <w:p>
+            <w:r>
+              <w:rPr>
+                <w:rFonts w:ascii="Microsoft YaHei" w:hAnsi="Microsoft YaHei"/>
+                <w:sz w:val="20"/>
+              </w:rPr>
+              <w:t>136-203</w:t>
+            </w:r>
+          </w:p>
+        </w:tc>
+        <w:tc>
+          <w:tcPr>
+            <w:tcW w:type="dxa" w:w="2880"/>
+          </w:tcPr>
+          <w:p>
+            <w:r>
+              <w:rPr>
+                <w:rFonts w:ascii="Microsoft YaHei" w:hAnsi="Microsoft YaHei"/>
+                <w:sz w:val="20"/>
+              </w:rPr>
+              <w:t>展示 DQN 为什么数学上无法处理连续动作</w:t>
+            </w:r>
+          </w:p>
+        </w:tc>
+      </w:tr>
+      <w:tr>
+        <w:tc>
+          <w:tcPr>
+            <w:tcW w:type="dxa" w:w="2880"/>
+          </w:tcPr>
+          <w:p>
+            <w:r>
+              <w:rPr>
+                <w:rFonts w:ascii="Microsoft YaHei" w:hAnsi="Microsoft YaHei"/>
+                <w:sz w:val="20"/>
+              </w:rPr>
+              <w:t>test_env 环境测试</w:t>
             </w:r>
           </w:p>
         </w:tc>
@@ -253,7 +327,7 @@
                 <w:rFonts w:ascii="Microsoft YaHei" w:hAnsi="Microsoft YaHei"/>
                 <w:sz w:val="20"/>
               </w:rPr>
-              <w:t>Random policy test</w:t>
+              <w:t>随机策略跑一局看看环境是否正常</w:t>
             </w:r>
           </w:p>
         </w:tc>
@@ -269,7 +343,7 @@
                 <w:rFonts w:ascii="Microsoft YaHei" w:hAnsi="Microsoft YaHei"/>
                 <w:sz w:val="20"/>
               </w:rPr>
-              <w:t>Main</w:t>
+              <w:t>主程序</w:t>
             </w:r>
           </w:p>
         </w:tc>
@@ -297,7 +371,7 @@
                 <w:rFonts w:ascii="Microsoft YaHei" w:hAnsi="Microsoft YaHei"/>
                 <w:sz w:val="20"/>
               </w:rPr>
-              <w:t>Run test + demo</w:t>
+              <w:t>调用 test_env 和 demo_dqn_failure</w:t>
             </w:r>
           </w:p>
         </w:tc>
@@ -316,19 +390,19 @@
         <w:rPr>
           <w:color w:val="1F3A5F"/>
         </w:rPr>
-        <w:t>EMSEnv Class (Lines 26-111)</w:t>
+        <w:t>EMSEnv 环境类 —— 逐行解释（26-111 行）</w:t>
       </w:r>
     </w:p>
     <w:p>
       <w:pPr>
-        <w:spacing w:before="80" w:after="20"/>
+        <w:spacing w:before="120" w:after="40"/>
       </w:pPr>
       <w:r>
         <w:rPr>
           <w:color w:val="999999"/>
           <w:sz w:val="16"/>
         </w:rPr>
-        <w:t xml:space="preserve">L26  </w:t>
+        <w:t xml:space="preserve">  L26  </w:t>
       </w:r>
       <w:r>
         <w:rPr>
@@ -342,28 +416,27 @@
     </w:p>
     <w:p>
       <w:pPr>
-        <w:spacing w:after="60"/>
-        <w:ind w:left="567"/>
+        <w:spacing w:before="0" w:after="120"/>
+        <w:ind w:left="454"/>
       </w:pPr>
       <w:r>
         <w:rPr>
           <w:rFonts w:ascii="Microsoft YaHei" w:hAnsi="Microsoft YaHei"/>
-          <w:b w:val="0"/>
-          <w:sz w:val="20"/>
+          <w:sz w:val="21"/>
         </w:rPr>
-        <w:t>Defines the simplified EMS environment. Key difference from GridWorld: states are continuous (not discrete grids), actions are continuous (not 4 directions).</w:t>
+        <w:t>定义 EMS 简化环境类。和 GridWorld 最关键的区别有两点：第一，状态是连续向量 [SOC, P_load]（不是离散格子编号 0-15），第二，动作是连续值 P_fc ∈ [0,1]（不是 4 个方向键 ↑↓←→）。这两个区别决定了 DQN 用不了。</w:t>
       </w:r>
     </w:p>
     <w:p>
       <w:pPr>
-        <w:spacing w:before="80" w:after="20"/>
+        <w:spacing w:before="120" w:after="40"/>
       </w:pPr>
       <w:r>
         <w:rPr>
           <w:color w:val="999999"/>
           <w:sz w:val="16"/>
         </w:rPr>
-        <w:t xml:space="preserve">L35  </w:t>
+        <w:t xml:space="preserve">  L35  </w:t>
       </w:r>
       <w:r>
         <w:rPr>
@@ -377,28 +450,27 @@
     </w:p>
     <w:p>
       <w:pPr>
-        <w:spacing w:after="60"/>
-        <w:ind w:left="567"/>
+        <w:spacing w:before="0" w:after="120"/>
+        <w:ind w:left="454"/>
       </w:pPr>
       <w:r>
         <w:rPr>
           <w:rFonts w:ascii="Microsoft YaHei" w:hAnsi="Microsoft YaHei"/>
-          <w:b w:val="0"/>
-          <w:sz w:val="20"/>
+          <w:sz w:val="21"/>
         </w:rPr>
-        <w:t>Init env params. SOC range 0.2-0.9, state_dim=2, action_dim=1.</w:t>
+        <w:t>初始化环境参数。设定 SOC 范围 0.2-0.9（锂电池安全范围），状态维度 2，动作维度 1。电池容量设了 50 kWh，每步时长 1 分钟。最后调用 self.reset() 初始化状态。</w:t>
       </w:r>
     </w:p>
     <w:p>
       <w:pPr>
-        <w:spacing w:before="80" w:after="20"/>
+        <w:spacing w:before="120" w:after="40"/>
       </w:pPr>
       <w:r>
         <w:rPr>
           <w:color w:val="999999"/>
           <w:sz w:val="16"/>
         </w:rPr>
-        <w:t xml:space="preserve">L39  </w:t>
+        <w:t xml:space="preserve">  L39  </w:t>
       </w:r>
       <w:r>
         <w:rPr>
@@ -412,28 +484,27 @@
     </w:p>
     <w:p>
       <w:pPr>
-        <w:spacing w:after="60"/>
-        <w:ind w:left="567"/>
+        <w:spacing w:before="0" w:after="120"/>
+        <w:ind w:left="454"/>
       </w:pPr>
       <w:r>
         <w:rPr>
           <w:rFonts w:ascii="Microsoft YaHei" w:hAnsi="Microsoft YaHei"/>
-          <w:b w:val="0"/>
-          <w:sz w:val="20"/>
+          <w:sz w:val="21"/>
         </w:rPr>
-        <w:t>State = [SOC, P_load], 2D continuous vector. Compare to GridWorld's 16 discrete states.</w:t>
+        <w:t>状态维度 = 2。状态向量是 [SOC, P_load] 两个连续值。对比 GridWorld 的状态是 16 个离散格子编号，用 one-hot 编码后是 16 维。这里直接用 2 维连续值输入网络——这就是"连续状态"的含义。</w:t>
       </w:r>
     </w:p>
     <w:p>
       <w:pPr>
-        <w:spacing w:before="80" w:after="20"/>
+        <w:spacing w:before="120" w:after="40"/>
       </w:pPr>
       <w:r>
         <w:rPr>
           <w:color w:val="999999"/>
           <w:sz w:val="16"/>
         </w:rPr>
-        <w:t xml:space="preserve">L40  </w:t>
+        <w:t xml:space="preserve">  L40  </w:t>
       </w:r>
       <w:r>
         <w:rPr>
@@ -447,28 +518,27 @@
     </w:p>
     <w:p>
       <w:pPr>
-        <w:spacing w:after="60"/>
-        <w:ind w:left="567"/>
+        <w:spacing w:before="0" w:after="120"/>
+        <w:ind w:left="454"/>
       </w:pPr>
       <w:r>
         <w:rPr>
           <w:rFonts w:ascii="Microsoft YaHei" w:hAnsi="Microsoft YaHei"/>
-          <w:b w:val="0"/>
-          <w:sz w:val="20"/>
+          <w:sz w:val="21"/>
         </w:rPr>
-        <w:t>Action = P_fc, 1D continuous value (normalized [0,1]). Compare to GridWorld's 4 discrete actions.</w:t>
+        <w:t>动作维度 = 1。动作是 P_fc（燃料电池功率），归一化到 [0,1] 范围。对比 GridWorld 的动作是 4 个离散值（上 0、下 1、左 2、右 3）。这里动作是一个连续区间中的任意值——这就是"连续动作"的含义。</w:t>
       </w:r>
     </w:p>
     <w:p>
       <w:pPr>
-        <w:spacing w:before="80" w:after="20"/>
+        <w:spacing w:before="120" w:after="40"/>
       </w:pPr>
       <w:r>
         <w:rPr>
           <w:color w:val="999999"/>
           <w:sz w:val="16"/>
         </w:rPr>
-        <w:t xml:space="preserve">L49  </w:t>
+        <w:t xml:space="preserve">  L49  </w:t>
       </w:r>
       <w:r>
         <w:rPr>
@@ -482,28 +552,27 @@
     </w:p>
     <w:p>
       <w:pPr>
-        <w:spacing w:after="60"/>
-        <w:ind w:left="567"/>
+        <w:spacing w:before="0" w:after="120"/>
+        <w:ind w:left="454"/>
       </w:pPr>
       <w:r>
         <w:rPr>
           <w:rFonts w:ascii="Microsoft YaHei" w:hAnsi="Microsoft YaHei"/>
-          <w:b w:val="0"/>
-          <w:sz w:val="20"/>
+          <w:sz w:val="21"/>
         </w:rPr>
-        <w:t>Reset env. SOC=0.6, P_load=0.5 kW. Returns initial state.</w:t>
+        <w:t>重置环境到初始状态。SOC 设为 0.6（60%，锂电池最优工作点附近），P_load 设为 0.5 kW。max_steps = 200（一局最多 200 步，防止无限循环）。返回 np.float32 数组。</w:t>
       </w:r>
     </w:p>
     <w:p>
       <w:pPr>
-        <w:spacing w:before="80" w:after="20"/>
+        <w:spacing w:before="120" w:after="40"/>
       </w:pPr>
       <w:r>
         <w:rPr>
           <w:color w:val="999999"/>
           <w:sz w:val="16"/>
         </w:rPr>
-        <w:t xml:space="preserve">L57  </w:t>
+        <w:t xml:space="preserve">  L57  </w:t>
       </w:r>
       <w:r>
         <w:rPr>
@@ -517,28 +586,27 @@
     </w:p>
     <w:p>
       <w:pPr>
-        <w:spacing w:after="60"/>
-        <w:ind w:left="567"/>
+        <w:spacing w:before="0" w:after="120"/>
+        <w:ind w:left="454"/>
       </w:pPr>
       <w:r>
         <w:rPr>
           <w:rFonts w:ascii="Microsoft YaHei" w:hAnsi="Microsoft YaHei"/>
-          <w:b w:val="0"/>
-          <w:sz w:val="20"/>
+          <w:sz w:val="21"/>
         </w:rPr>
-        <w:t>Returns current state [SOC, P_load] as numpy float32 array.</w:t>
+        <w:t>返回当前状态 [SOC, P_load]，numpy float32 数组。这个格式直接喂给 PyTorch 网络。和 GridWorld 的 state_to_onehot 不同——那里要把整数编号转成 16 维 one-hot 向量，这里直接用 2 维连续向量。</w:t>
       </w:r>
     </w:p>
     <w:p>
       <w:pPr>
-        <w:spacing w:before="80" w:after="20"/>
+        <w:spacing w:before="120" w:after="40"/>
       </w:pPr>
       <w:r>
         <w:rPr>
           <w:color w:val="999999"/>
           <w:sz w:val="16"/>
         </w:rPr>
-        <w:t xml:space="preserve">L61  </w:t>
+        <w:t xml:space="preserve">  L61  </w:t>
       </w:r>
       <w:r>
         <w:rPr>
@@ -552,28 +620,27 @@
     </w:p>
     <w:p>
       <w:pPr>
-        <w:spacing w:after="60"/>
-        <w:ind w:left="567"/>
+        <w:spacing w:before="0" w:after="120"/>
+        <w:ind w:left="454"/>
       </w:pPr>
       <w:r>
         <w:rPr>
           <w:rFonts w:ascii="Microsoft YaHei" w:hAnsi="Microsoft YaHei"/>
-          <w:b w:val="0"/>
-          <w:sz w:val="20"/>
+          <w:sz w:val="21"/>
         </w:rPr>
-        <w:t>Core: execute action. Action is normalized [0,1] P_fc.</w:t>
+        <w:t>环境的核心：执行动作。输入 action 是归一化 [0,1] 的 P_fc 值。输出 (next_state, reward, done, info)。和 GridWorld 的 step 接口完全一样，只是状态和动作都从离散变成了连续。</w:t>
       </w:r>
     </w:p>
     <w:p>
       <w:pPr>
-        <w:spacing w:before="80" w:after="20"/>
+        <w:spacing w:before="120" w:after="40"/>
       </w:pPr>
       <w:r>
         <w:rPr>
           <w:color w:val="999999"/>
           <w:sz w:val="16"/>
         </w:rPr>
-        <w:t xml:space="preserve">L68  </w:t>
+        <w:t xml:space="preserve">  L68  </w:t>
       </w:r>
       <w:r>
         <w:rPr>
@@ -587,28 +654,27 @@
     </w:p>
     <w:p>
       <w:pPr>
-        <w:spacing w:after="60"/>
-        <w:ind w:left="567"/>
+        <w:spacing w:before="0" w:after="120"/>
+        <w:ind w:left="454"/>
       </w:pPr>
       <w:r>
         <w:rPr>
           <w:rFonts w:ascii="Microsoft YaHei" w:hAnsi="Microsoft YaHei"/>
-          <w:b w:val="0"/>
-          <w:sz w:val="20"/>
+          <w:sz w:val="21"/>
         </w:rPr>
-        <w:t>Denormalize: map [0,1] to [0,30] kW. E.g., action=0.5 -&gt; P_fc=15kW.</w:t>
+        <w:t>反归一化。网络输出的动作是 [0,1] 之间的归一化值，这里乘以 30 映射到 [0,30] kW（实际燃料电池的功率范围）。比如 action=0.5 → P_fc=15kW，action=1.0 → P_fc=30kW。np.clip 防止动作越界。</w:t>
       </w:r>
     </w:p>
     <w:p>
       <w:pPr>
-        <w:spacing w:before="80" w:after="20"/>
+        <w:spacing w:before="120" w:after="40"/>
       </w:pPr>
       <w:r>
         <w:rPr>
           <w:color w:val="999999"/>
           <w:sz w:val="16"/>
         </w:rPr>
-        <w:t xml:space="preserve">L71  </w:t>
+        <w:t xml:space="preserve">  L71  </w:t>
       </w:r>
       <w:r>
         <w:rPr>
@@ -617,33 +683,32 @@
           <w:color w:val="1F3A5F"/>
           <w:sz w:val="20"/>
         </w:rPr>
-        <w:t>self.p_load = 0.3 + 0.4 * (0.5 + 0.5 * np.sin(...))</w:t>
+        <w:t>self.p_load = 0.3 + 0.4 * (0.5 + 0.5 * np.sin(self.steps * 0.1))</w:t>
       </w:r>
     </w:p>
     <w:p>
       <w:pPr>
-        <w:spacing w:after="60"/>
-        <w:ind w:left="567"/>
+        <w:spacing w:before="0" w:after="120"/>
+        <w:ind w:left="454"/>
       </w:pPr>
       <w:r>
         <w:rPr>
           <w:rFonts w:ascii="Microsoft YaHei" w:hAnsi="Microsoft YaHei"/>
-          <w:b w:val="0"/>
-          <w:sz w:val="20"/>
+          <w:sz w:val="21"/>
         </w:rPr>
-        <w:t>Simulate load variation using sine wave, range ~0.3-0.7.</w:t>
+        <w:t>生成负载功率（模拟实际工况）。用正弦波让负载在 0.3-0.7 kW 之间波动——模拟实际船舶/车辆运行中负载的变化。这是和 GridWorld 不同的地方：GridWorld 的奖励和转换是固定的概率，而这里的负载是随时间变化的连续值。</w:t>
       </w:r>
     </w:p>
     <w:p>
       <w:pPr>
-        <w:spacing w:before="80" w:after="20"/>
+        <w:spacing w:before="120" w:after="40"/>
       </w:pPr>
       <w:r>
         <w:rPr>
           <w:color w:val="999999"/>
           <w:sz w:val="16"/>
         </w:rPr>
-        <w:t xml:space="preserve">L77  </w:t>
+        <w:t xml:space="preserve">  L77  </w:t>
       </w:r>
       <w:r>
         <w:rPr>
@@ -657,28 +722,27 @@
     </w:p>
     <w:p>
       <w:pPr>
-        <w:spacing w:after="60"/>
-        <w:ind w:left="567"/>
+        <w:spacing w:before="0" w:after="120"/>
+        <w:ind w:left="454"/>
       </w:pPr>
       <w:r>
         <w:rPr>
           <w:rFonts w:ascii="Microsoft YaHei" w:hAnsi="Microsoft YaHei"/>
-          <w:b w:val="0"/>
-          <w:sz w:val="20"/>
+          <w:sz w:val="21"/>
         </w:rPr>
-        <w:t>SOC change = net power / capacity. P_fc &gt; P_load -&gt; charging, SOC up.</w:t>
+        <w:t>计算 SOC 变化量。公式很简单：SOC 变化 = 净功率 / 电池容量。P_fc &gt; P_load（发电大于用电）→ SOC 上升（充电）。P_fc &lt; P_load（发电小于用电）→ SOC 下降（放电）。这个变化量累加到当前 SOC 上。</w:t>
       </w:r>
     </w:p>
     <w:p>
       <w:pPr>
-        <w:spacing w:before="80" w:after="20"/>
+        <w:spacing w:before="120" w:after="40"/>
       </w:pPr>
       <w:r>
         <w:rPr>
           <w:color w:val="999999"/>
           <w:sz w:val="16"/>
         </w:rPr>
-        <w:t xml:space="preserve">L82  </w:t>
+        <w:t xml:space="preserve">  L82  </w:t>
       </w:r>
       <w:r>
         <w:rPr>
@@ -692,28 +756,27 @@
     </w:p>
     <w:p>
       <w:pPr>
-        <w:spacing w:after="60"/>
-        <w:ind w:left="567"/>
+        <w:spacing w:before="0" w:after="120"/>
+        <w:ind w:left="454"/>
       </w:pPr>
       <w:r>
         <w:rPr>
           <w:rFonts w:ascii="Microsoft YaHei" w:hAnsi="Microsoft YaHei"/>
-          <w:b w:val="0"/>
-          <w:sz w:val="20"/>
+          <w:sz w:val="21"/>
         </w:rPr>
-        <w:t>Fuel cost. Higher P_fc = more fuel = more negative reward.</w:t>
+        <w:t>燃料成本（负奖励）。P_fc 越大，消耗的氢气越多，负奖励越大。这是优化的主要目标——最小化燃料消耗。在 EMS 问题中，这对应着"经济性"指标。</w:t>
       </w:r>
     </w:p>
     <w:p>
       <w:pPr>
-        <w:spacing w:before="80" w:after="20"/>
+        <w:spacing w:before="120" w:after="40"/>
       </w:pPr>
       <w:r>
         <w:rPr>
           <w:color w:val="999999"/>
           <w:sz w:val="16"/>
         </w:rPr>
-        <w:t xml:space="preserve">L85  </w:t>
+        <w:t xml:space="preserve">  L85  </w:t>
       </w:r>
       <w:r>
         <w:rPr>
@@ -727,28 +790,27 @@
     </w:p>
     <w:p>
       <w:pPr>
-        <w:spacing w:after="60"/>
-        <w:ind w:left="567"/>
+        <w:spacing w:before="0" w:after="120"/>
+        <w:ind w:left="454"/>
       </w:pPr>
       <w:r>
         <w:rPr>
           <w:rFonts w:ascii="Microsoft YaHei" w:hAnsi="Microsoft YaHei"/>
-          <w:b w:val="0"/>
-          <w:sz w:val="20"/>
+          <w:sz w:val="21"/>
         </w:rPr>
-        <w:t>SOC penalty. Deviation from 0.6 is penalized.</w:t>
+        <w:t>SOC 偏离惩罚。SOC 偏离 0.6（目标值）越远，惩罚越大。这个惩罚项的目的是让智能体学会维持 SOC，避免电池过充或过放。在 EMS 中，这对应着"安全性"指标。</w:t>
       </w:r>
     </w:p>
     <w:p>
       <w:pPr>
-        <w:spacing w:before="80" w:after="20"/>
+        <w:spacing w:before="120" w:after="40"/>
       </w:pPr>
       <w:r>
         <w:rPr>
           <w:color w:val="999999"/>
           <w:sz w:val="16"/>
         </w:rPr>
-        <w:t xml:space="preserve">L89  </w:t>
+        <w:t xml:space="preserve">  L89  </w:t>
       </w:r>
       <w:r>
         <w:rPr>
@@ -762,16 +824,49 @@
     </w:p>
     <w:p>
       <w:pPr>
-        <w:spacing w:after="60"/>
-        <w:ind w:left="567"/>
+        <w:spacing w:before="0" w:after="120"/>
+        <w:ind w:left="454"/>
       </w:pPr>
       <w:r>
         <w:rPr>
           <w:rFonts w:ascii="Microsoft YaHei" w:hAnsi="Microsoft YaHei"/>
-          <w:b w:val="0"/>
+          <w:sz w:val="21"/>
+        </w:rPr>
+        <w:t>SOC 越界惩罚。如果 SOC 超出了 [0.2, 0.9] 的安全范围，额外罚 -1.0。这是"硬约束"——在实际系统中，SOC 出界会触发保护机制或者损坏电池。</w:t>
+      </w:r>
+    </w:p>
+    <w:p>
+      <w:pPr>
+        <w:spacing w:before="120" w:after="40"/>
+      </w:pPr>
+      <w:r>
+        <w:rPr>
+          <w:color w:val="999999"/>
+          <w:sz w:val="16"/>
+        </w:rPr>
+        <w:t xml:space="preserve">  L96  </w:t>
+      </w:r>
+      <w:r>
+        <w:rPr>
+          <w:rFonts w:ascii="Consolas" w:hAnsi="Consolas"/>
+          <w:b/>
+          <w:color w:val="1F3A5F"/>
           <w:sz w:val="20"/>
         </w:rPr>
-        <w:t>Bound penalty. SOC outside [0.2, 0.9] gets -1.0.</w:t>
+        <w:t>done = (self.steps &gt;= self.max_steps or ...)</w:t>
+      </w:r>
+    </w:p>
+    <w:p>
+      <w:pPr>
+        <w:spacing w:before="0" w:after="120"/>
+        <w:ind w:left="454"/>
+      </w:pPr>
+      <w:r>
+        <w:rPr>
+          <w:rFonts w:ascii="Microsoft YaHei" w:hAnsi="Microsoft YaHei"/>
+          <w:sz w:val="21"/>
+        </w:rPr>
+        <w:t>结束条件：超过最大步数（200），或者 SOC 越界（低于 0.2 或高于 0.9）。在 GridWorld 中是走到终点或陷阱结束。这里是通过控制步数和 SOC 范围来结束。</w:t>
       </w:r>
     </w:p>
     <w:p>
@@ -787,7 +882,7 @@
         <w:rPr>
           <w:color w:val="1F3A5F"/>
         </w:rPr>
-        <w:t>DQN Failure Demo (Lines 115-203)</w:t>
+        <w:t>DQN 为什么不行 —— 逐行解释（115-203 行）</w:t>
       </w:r>
     </w:p>
     <w:p>
@@ -800,19 +895,30 @@
           <w:b/>
           <w:sz w:val="24"/>
         </w:rPr>
-        <w:t>This is the key section showing why DQN fundamentally cannot handle continuous actions.</w:t>
+        <w:t>这个部分的核心目的：让你亲眼看到 DQN 在处理连续动作时的数学困境。DQN 不行不是调参问题，是数学结构决定的。</w:t>
       </w:r>
     </w:p>
     <w:p>
       <w:pPr>
-        <w:spacing w:before="80" w:after="20"/>
+        <w:pStyle w:val="Heading2"/>
+      </w:pPr>
+      <w:r>
+        <w:rPr>
+          <w:color w:val="1F3A5F"/>
+        </w:rPr>
+        <w:t>DQN_Continuous 网络（115-133 行）</w:t>
+      </w:r>
+    </w:p>
+    <w:p>
+      <w:pPr>
+        <w:spacing w:before="120" w:after="40"/>
       </w:pPr>
       <w:r>
         <w:rPr>
           <w:color w:val="999999"/>
           <w:sz w:val="16"/>
         </w:rPr>
-        <w:t xml:space="preserve">L115  </w:t>
+        <w:t xml:space="preserve">  L115  </w:t>
       </w:r>
       <w:r>
         <w:rPr>
@@ -826,28 +932,27 @@
     </w:p>
     <w:p>
       <w:pPr>
-        <w:spacing w:after="60"/>
-        <w:ind w:left="567"/>
+        <w:spacing w:before="0" w:after="120"/>
+        <w:ind w:left="454"/>
       </w:pPr>
       <w:r>
         <w:rPr>
           <w:rFonts w:ascii="Microsoft YaHei" w:hAnsi="Microsoft YaHei"/>
-          <w:b w:val="0"/>
-          <w:sz w:val="20"/>
+          <w:sz w:val="21"/>
         </w:rPr>
-        <w:t>Fake DQN - output layer has only 1 neuron (not 4). It directly outputs action values instead of Q values. This is supervised learning, not RL.</w:t>
+        <w:t>定义一个"假 DQN"网络。为什么说假？因为标准 DQN 的输出层有 N 个神经元（N = 离散动作数），每个对应一个动作的 Q 值。但这个网络输出层只有 1 个神经元，直接输出一个连续值——这本质上是个回归网络，不是 DQN。</w:t>
       </w:r>
     </w:p>
     <w:p>
       <w:pPr>
-        <w:spacing w:before="80" w:after="20"/>
+        <w:spacing w:before="120" w:after="40"/>
       </w:pPr>
       <w:r>
         <w:rPr>
           <w:color w:val="999999"/>
           <w:sz w:val="16"/>
         </w:rPr>
-        <w:t xml:space="preserve">L126  </w:t>
+        <w:t xml:space="preserve">  L126  </w:t>
       </w:r>
       <w:r>
         <w:rPr>
@@ -861,28 +966,38 @@
     </w:p>
     <w:p>
       <w:pPr>
-        <w:spacing w:after="60"/>
-        <w:ind w:left="567"/>
+        <w:spacing w:before="0" w:after="120"/>
+        <w:ind w:left="454"/>
       </w:pPr>
       <w:r>
         <w:rPr>
           <w:rFonts w:ascii="Microsoft YaHei" w:hAnsi="Microsoft YaHei"/>
-          <w:b w:val="0"/>
-          <w:sz w:val="20"/>
+          <w:sz w:val="21"/>
         </w:rPr>
-        <w:t>Network: 2D input -&gt; 64 hidden -&gt; 1D output. Standard DQN outputs Q-values for each action; this forcibly outputs a single continuous value.</w:t>
+        <w:t>网络结构很简单：2 维输入（状态 [SOC, P_load]）→ 64 维隐藏层 → ReLU → 1 维输出。这个输出被当做"动作"直接使用，而不是 Q 值。注意：这和标准 DQN 有本质区别。标准 DQN 的输出是"每个动作的 Q 值"，需要 argmax 选动作。这里直接输出动作值，绕过了 argmax——但也绕过了 Q-learning 的核心机制。</w:t>
       </w:r>
     </w:p>
     <w:p>
       <w:pPr>
-        <w:spacing w:before="80" w:after="20"/>
+        <w:pStyle w:val="Heading2"/>
+      </w:pPr>
+      <w:r>
+        <w:rPr>
+          <w:color w:val="1F3A5F"/>
+        </w:rPr>
+        <w:t>demo_dqn_failure 演示（136-203 行）</w:t>
+      </w:r>
+    </w:p>
+    <w:p>
+      <w:pPr>
+        <w:spacing w:before="120" w:after="40"/>
       </w:pPr>
       <w:r>
         <w:rPr>
           <w:color w:val="999999"/>
           <w:sz w:val="16"/>
         </w:rPr>
-        <w:t xml:space="preserve">L136  </w:t>
+        <w:t xml:space="preserve">  L136  </w:t>
       </w:r>
       <w:r>
         <w:rPr>
@@ -896,28 +1011,27 @@
     </w:p>
     <w:p>
       <w:pPr>
-        <w:spacing w:after="60"/>
-        <w:ind w:left="567"/>
+        <w:spacing w:before="0" w:after="120"/>
+        <w:ind w:left="454"/>
       </w:pPr>
       <w:r>
         <w:rPr>
           <w:rFonts w:ascii="Microsoft YaHei" w:hAnsi="Microsoft YaHei"/>
-          <w:b w:val="0"/>
-          <w:sz w:val="20"/>
+          <w:sz w:val="21"/>
         </w:rPr>
-        <w:t>Main demo function. Shows two fundamental problems.</w:t>
+        <w:t>演示 DQN 为什么不行。核心论点：DQN 的问题不是参数没调好，而是数学结构根本上就无法处理连续动作。</w:t>
       </w:r>
     </w:p>
     <w:p>
       <w:pPr>
-        <w:spacing w:before="80" w:after="20"/>
+        <w:spacing w:before="120" w:after="40"/>
       </w:pPr>
       <w:r>
         <w:rPr>
           <w:color w:val="999999"/>
           <w:sz w:val="16"/>
         </w:rPr>
-        <w:t xml:space="preserve">L157  </w:t>
+        <w:t xml:space="preserve">  L157  </w:t>
       </w:r>
       <w:r>
         <w:rPr>
@@ -926,33 +1040,32 @@
           <w:color w:val="1F3A5F"/>
           <w:sz w:val="20"/>
         </w:rPr>
-        <w:t>print('Problem 1: Cannot argmax')</w:t>
+        <w:t>print("问题 1: 没法 argmax")</w:t>
       </w:r>
     </w:p>
     <w:p>
       <w:pPr>
-        <w:spacing w:after="60"/>
-        <w:ind w:left="567"/>
+        <w:spacing w:before="0" w:after="120"/>
+        <w:ind w:left="454"/>
       </w:pPr>
       <w:r>
         <w:rPr>
           <w:rFonts w:ascii="Microsoft YaHei" w:hAnsi="Microsoft YaHei"/>
-          <w:b w:val="0"/>
-          <w:sz w:val="20"/>
+          <w:sz w:val="21"/>
         </w:rPr>
-        <w:t>Problem 1: DQN selects actions by argmax over all actions. Continuous actions have infinite possibilities - cannot enumerate.</w:t>
+        <w:t>DQN 选动作的核心步骤是 a = argmax Q(s,a)，也就是遍历所有动作，找到 Q 值最大的那个。在 GridWorld 的 4 个离散动作上这很容易。但连续动作有无限多个可能取值（比如 P_fc 可以是 0 kW、0.1 kW、0.01 kW、3.14159 kW……），你没法枚举所有可能性来求 argmax。这就叫"数学结构决定"——不管你怎么调参，argmax 都要求遍历，连续空间没法遍历。</w:t>
       </w:r>
     </w:p>
     <w:p>
       <w:pPr>
-        <w:spacing w:before="80" w:after="20"/>
+        <w:spacing w:before="120" w:after="40"/>
       </w:pPr>
       <w:r>
         <w:rPr>
           <w:color w:val="999999"/>
           <w:sz w:val="16"/>
         </w:rPr>
-        <w:t xml:space="preserve">L163  </w:t>
+        <w:t xml:space="preserve">  L163  </w:t>
       </w:r>
       <w:r>
         <w:rPr>
@@ -961,33 +1074,32 @@
           <w:color w:val="1F3A5F"/>
           <w:sz w:val="20"/>
         </w:rPr>
-        <w:t>print('Problem 2: Update formula also breaks')</w:t>
+        <w:t>print("问题 2: 即使强行输出一个动作值，更新公式也不对")</w:t>
       </w:r>
     </w:p>
     <w:p>
       <w:pPr>
-        <w:spacing w:after="60"/>
-        <w:ind w:left="567"/>
+        <w:spacing w:before="0" w:after="120"/>
+        <w:ind w:left="454"/>
       </w:pPr>
       <w:r>
         <w:rPr>
           <w:rFonts w:ascii="Microsoft YaHei" w:hAnsi="Microsoft YaHei"/>
-          <w:b w:val="0"/>
-          <w:sz w:val="20"/>
+          <w:sz w:val="21"/>
         </w:rPr>
-        <w:t>Problem 2: Q-learning formula target = r + gamma * max Q(s', a') requires max over a' - impossible for continuous actions.</w:t>
+        <w:t>Q-learning 的更新公式是 target = r + γ·max Q(s', a')。max Q(s', a') 需要计算"下个状态的最优 Q 值"，这又需要遍历所有可能的 a'——连续空间里没法算。有人会说"那我把 max 改成其他操作不行吗？"——改了就不叫 Q-learning 了，公式也不收敛了。</w:t>
       </w:r>
     </w:p>
     <w:p>
       <w:pPr>
-        <w:spacing w:before="80" w:after="20"/>
+        <w:spacing w:before="120" w:after="40"/>
       </w:pPr>
       <w:r>
         <w:rPr>
           <w:color w:val="999999"/>
           <w:sz w:val="16"/>
         </w:rPr>
-        <w:t xml:space="preserve">L181  </w:t>
+        <w:t xml:space="preserve">  L181  </w:t>
       </w:r>
       <w:r>
         <w:rPr>
@@ -1001,28 +1113,27 @@
     </w:p>
     <w:p>
       <w:pPr>
-        <w:spacing w:after="60"/>
-        <w:ind w:left="567"/>
+        <w:spacing w:before="0" w:after="120"/>
+        <w:ind w:left="454"/>
       </w:pPr>
       <w:r>
         <w:rPr>
           <w:rFonts w:ascii="Microsoft YaHei" w:hAnsi="Microsoft YaHei"/>
-          <w:b w:val="0"/>
-          <w:sz w:val="20"/>
+          <w:sz w:val="21"/>
         </w:rPr>
-        <w:t>Forcibly outputs an action value directly. sigmoid ensures [0,1] range. But this is not RL - no Q-value concept.</w:t>
+        <w:t>这里强行让网络直接输出动作值。sigmoid 保证输出范围在 [0,1] 之间。但注意：这本质上是监督学习（输入状态 → 输出动作），没有 Q 值的概念，没有贝尔曼公式，不是强化学习。这就像"把方向盘当油门踩——虽然都是踩踏板，但完全不是一回事。"</w:t>
       </w:r>
     </w:p>
     <w:p>
       <w:pPr>
-        <w:spacing w:before="80" w:after="20"/>
+        <w:spacing w:before="120" w:after="40"/>
       </w:pPr>
       <w:r>
         <w:rPr>
           <w:color w:val="999999"/>
           <w:sz w:val="16"/>
         </w:rPr>
-        <w:t xml:space="preserve">L199  </w:t>
+        <w:t xml:space="preserve">  L199  </w:t>
       </w:r>
       <w:r>
         <w:rPr>
@@ -1031,33 +1142,32 @@
           <w:color w:val="1F3A5F"/>
           <w:sz w:val="20"/>
         </w:rPr>
-        <w:t>print('DQN cannot handle continuous actions.')</w:t>
+        <w:t>print("DQN 从数学结构上就无法处理连续动作。")</w:t>
       </w:r>
     </w:p>
     <w:p>
       <w:pPr>
-        <w:spacing w:after="60"/>
-        <w:ind w:left="567"/>
+        <w:spacing w:before="0" w:after="120"/>
+        <w:ind w:left="454"/>
       </w:pPr>
       <w:r>
         <w:rPr>
           <w:rFonts w:ascii="Microsoft YaHei" w:hAnsi="Microsoft YaHei"/>
-          <w:b w:val="0"/>
-          <w:sz w:val="20"/>
+          <w:sz w:val="21"/>
         </w:rPr>
-        <w:t>Core conclusion. This is a mathematical limitation (argmax requires enumeration), not a tuning problem.</w:t>
+        <w:t>整段演示的核心结论。DQN 的两个核心操作——argmax（选动作）和 max（算 target）——都要求遍历动作空间。连续空间有无穷多个点，没法遍历。这不是换个网络结构、调大 hidden layer、加更多训练就能解决的。</w:t>
       </w:r>
     </w:p>
     <w:p>
       <w:pPr>
-        <w:spacing w:before="80" w:after="20"/>
+        <w:spacing w:before="120" w:after="40"/>
       </w:pPr>
       <w:r>
         <w:rPr>
           <w:color w:val="999999"/>
           <w:sz w:val="16"/>
         </w:rPr>
-        <w:t xml:space="preserve">L202  </w:t>
+        <w:t xml:space="preserve">  L202  </w:t>
       </w:r>
       <w:r>
         <w:rPr>
@@ -1066,21 +1176,20 @@
           <w:color w:val="1F3A5F"/>
           <w:sz w:val="20"/>
         </w:rPr>
-        <w:t>print('Must switch to Policy Gradient methods.')</w:t>
+        <w:t>print("要处理连续动作，必须换方法——策略梯度。")</w:t>
       </w:r>
     </w:p>
     <w:p>
       <w:pPr>
-        <w:spacing w:after="60"/>
-        <w:ind w:left="567"/>
+        <w:spacing w:before="0" w:after="120"/>
+        <w:ind w:left="454"/>
       </w:pPr>
       <w:r>
         <w:rPr>
           <w:rFonts w:ascii="Microsoft YaHei" w:hAnsi="Microsoft YaHei"/>
-          <w:b w:val="0"/>
-          <w:sz w:val="20"/>
+          <w:sz w:val="21"/>
         </w:rPr>
-        <w:t>Leads to next sections: REINFORCE, Actor-Critic, PPO.</w:t>
+        <w:t>引出下一步：REINFORCE。策略梯度方法不通过 Q 值来选动作，而是直接输出动作分布（均值和标准差），从分布中采样得到动作。这就绕开了 argmax 的限制——不需要枚举所有动作。</w:t>
       </w:r>
     </w:p>
     <w:sectPr>
@@ -1457,7 +1566,7 @@
     <w:qFormat/>
     <w:rsid w:val="00FC693F"/>
     <w:pPr>
-      <w:spacing w:line="324" w:lineRule="auto"/>
+      <w:spacing w:line="324" w:lineRule="auto" w:after="40"/>
     </w:pPr>
     <w:rPr>
       <w:rFonts w:ascii="Microsoft YaHei" w:hAnsi="Microsoft YaHei" w:eastAsia="Microsoft YaHei"/>

</xml_diff>